<commit_message>
Daniel 2nd re-audit: 4 MSG omissions restored (EN/KO), GDocs 12/12 verified
</commit_message>
<xml_diff>
--- a/gdocs_build/Daniel.docx
+++ b/gdocs_build/Daniel.docx
@@ -2759,7 +2759,7 @@
               <w:rPr>
                 <w:sz w:val="18"/>
               </w:rPr>
-              <w:t>The music started, and it was this epic band equipped with all the musical instruments of Babylon. And just like that, everyone—literally everyone, from all over—bowed down and worshiped the gold statue the king had set up.</w:t>
+              <w:t>The music started, and it was this epic band equipped with all the musical instruments of Babylon. And just like that, everyone—literally everyone, from all over—bowed down and worshiped the gold statue that King Nebuchadnezzar had set up.</w:t>
             </w:r>
           </w:p>
         </w:tc>
@@ -2830,7 +2830,7 @@
               <w:rPr>
                 <w:sz w:val="18"/>
               </w:rPr>
-              <w:t>But right then, some Babylonian fortune-tellers went to the king to snitch on the Jews. They were like, 'Hey, King, hope you live forever! You made a rule that everyone had to bow down to the statue when the music played, or they'd get thrown into a furnace, right? Well, these three Jewish guys you put in high positions in the province of Babylon—Shadrach, Meshach, and Abednego—are totally ignoring you.hey're not respecting your gods, and they're refusing to worship the gold statue.'</w:t>
+              <w:t>But right then, some Babylonian fortune-tellers went to the king to snitch on the Jews. They were like, 'Hey, King Nebuchadnezzar, hope you live forever! You gave strict orders that everyone had to bow down to the statue when the music played, or they'd get thrown into a roaring furnace, right? Well, these three Jewish guys you put in high positions in the province of Babylon—Shadrach, Meshach, and Abednego—are totally ignoring you. They're not respecting your gods, and they're refusing to worship the gold statue you set up.'</w:t>
             </w:r>
           </w:p>
         </w:tc>

</xml_diff>

<commit_message>
Daniel 배지 정밀화 (OT 전수조사): 7곳 (EN+KO) — ch2 배지 shift 2건, ch4/ch6/ch12 절별 분리. 독스 12/12 export-back OK.
</commit_message>
<xml_diff>
--- a/gdocs_build/Daniel.docx
+++ b/gdocs_build/Daniel.docx
@@ -2227,7 +2227,7 @@
                 <w:b/>
                 <w:sz w:val="16"/>
               </w:rPr>
-              <w:t>44-45</w:t>
+              <w:t>44</w:t>
             </w:r>
           </w:p>
           <w:p>
@@ -2258,7 +2258,7 @@
                 <w:b/>
                 <w:sz w:val="16"/>
               </w:rPr>
-              <w:t>44-45</w:t>
+              <w:t>44</w:t>
             </w:r>
           </w:p>
           <w:p>
@@ -2281,7 +2281,7 @@
                 <w:b/>
                 <w:sz w:val="16"/>
               </w:rPr>
-              <w:t>44-45</w:t>
+              <w:t>44</w:t>
             </w:r>
           </w:p>
           <w:p>
@@ -2306,7 +2306,7 @@
                 <w:b/>
                 <w:sz w:val="16"/>
               </w:rPr>
-              <w:t>44</w:t>
+              <w:t>45</w:t>
             </w:r>
           </w:p>
           <w:p>
@@ -2329,7 +2329,7 @@
                 <w:b/>
                 <w:sz w:val="16"/>
               </w:rPr>
-              <w:t>44</w:t>
+              <w:t>45</w:t>
             </w:r>
           </w:p>
           <w:p>
@@ -2352,7 +2352,7 @@
                 <w:b/>
                 <w:sz w:val="16"/>
               </w:rPr>
-              <w:t>44</w:t>
+              <w:t>45</w:t>
             </w:r>
           </w:p>
           <w:p>
@@ -5399,7 +5399,7 @@
                 <w:b/>
                 <w:sz w:val="16"/>
               </w:rPr>
-              <w:t>34-35</w:t>
+              <w:t>34</w:t>
             </w:r>
           </w:p>
           <w:p>
@@ -5430,7 +5430,7 @@
                 <w:b/>
                 <w:sz w:val="16"/>
               </w:rPr>
-              <w:t>34-35</w:t>
+              <w:t>34</w:t>
             </w:r>
           </w:p>
           <w:p>
@@ -5453,7 +5453,7 @@
                 <w:b/>
                 <w:sz w:val="16"/>
               </w:rPr>
-              <w:t>34-35</w:t>
+              <w:t>34</w:t>
             </w:r>
           </w:p>
           <w:p>
@@ -5478,7 +5478,7 @@
                 <w:b/>
                 <w:sz w:val="16"/>
               </w:rPr>
-              <w:t>34-35</w:t>
+              <w:t>35</w:t>
             </w:r>
           </w:p>
           <w:p>
@@ -5501,7 +5501,7 @@
                 <w:b/>
                 <w:sz w:val="16"/>
               </w:rPr>
-              <w:t>34-35</w:t>
+              <w:t>35</w:t>
             </w:r>
           </w:p>
           <w:p>
@@ -5524,7 +5524,7 @@
                 <w:b/>
                 <w:sz w:val="16"/>
               </w:rPr>
-              <w:t>34-35</w:t>
+              <w:t>35</w:t>
             </w:r>
           </w:p>
           <w:p>
@@ -6977,7 +6977,7 @@
                 <w:b/>
                 <w:sz w:val="16"/>
               </w:rPr>
-              <w:t>6-7</w:t>
+              <w:t>6</w:t>
             </w:r>
           </w:p>
           <w:p>
@@ -7008,7 +7008,7 @@
                 <w:b/>
                 <w:sz w:val="16"/>
               </w:rPr>
-              <w:t>6-7</w:t>
+              <w:t>6</w:t>
             </w:r>
           </w:p>
           <w:p>
@@ -7031,7 +7031,7 @@
                 <w:b/>
                 <w:sz w:val="16"/>
               </w:rPr>
-              <w:t>6-7</w:t>
+              <w:t>6</w:t>
             </w:r>
           </w:p>
           <w:p>
@@ -7056,7 +7056,7 @@
                 <w:b/>
                 <w:sz w:val="16"/>
               </w:rPr>
-              <w:t>6-7</w:t>
+              <w:t>7</w:t>
             </w:r>
           </w:p>
           <w:p>
@@ -7079,7 +7079,7 @@
                 <w:b/>
                 <w:sz w:val="16"/>
               </w:rPr>
-              <w:t>6-7</w:t>
+              <w:t>7</w:t>
             </w:r>
           </w:p>
           <w:p>
@@ -7102,7 +7102,7 @@
                 <w:b/>
                 <w:sz w:val="16"/>
               </w:rPr>
-              <w:t>6-7</w:t>
+              <w:t>7</w:t>
             </w:r>
           </w:p>
           <w:p>
@@ -14101,7 +14101,7 @@
                 <w:b/>
                 <w:sz w:val="16"/>
               </w:rPr>
-              <w:t>1-2</w:t>
+              <w:t>1</w:t>
             </w:r>
           </w:p>
           <w:p>
@@ -14124,7 +14124,7 @@
                 <w:b/>
                 <w:sz w:val="16"/>
               </w:rPr>
-              <w:t>1-2</w:t>
+              <w:t>1</w:t>
             </w:r>
           </w:p>
           <w:p>
@@ -14147,7 +14147,7 @@
                 <w:b/>
                 <w:sz w:val="16"/>
               </w:rPr>
-              <w:t>1-2</w:t>
+              <w:t>1</w:t>
             </w:r>
           </w:p>
           <w:p>

</xml_diff>